<commit_message>
submission: align official docs and deck with TS stack, public repo, test counts, next-phase framing
</commit_message>
<xml_diff>
--- a/submission/official/C-VIRSYS-SecuritySelfAssessment.docx
+++ b/submission/official/C-VIRSYS-SecuritySelfAssessment.docx
@@ -146,7 +146,7 @@
               <w:rPr>
                 <w:color w:val="17213A"/>
               </w:rPr>
-              <w:t>[SUBMISSION DATE] (deadline 20 Oct 2026, 23:59 Beijing time)</w:t>
+              <w:t>20 October 2026 (deadline 20 Oct 2026, 23:59 Beijing time)</w:t>
             </w:r>
           </w:p>
         </w:tc>
@@ -176,28 +176,22 @@
         <w:ind w:left="317"/>
       </w:pPr>
       <w:r>
-        <w:t xml:space="preserve">Scope: the Setu 桥 backend (Fastify/TypeScript, SQLite, scripted offline agent, sandbox bank) and web app in https://github.com/Zul-Qarnain/setu-fintechathon. This is a self-assessment written by the builders; it has not been independently reviewed or penetration-tested. Results quoted come from </w:t>
+        <w:t>Scope: the Setu 桥 backend (Fastify/TypeScript, SQLite, scripted offline agent, sandbox bank) and web app in the public repository https://github.com/Zul-Qarnain/setu-fintechathon. This self-assessment is written by the builders; every result quoted is reproducible from evidence/ and from real runs (make evidence), and an independent penetration test is planned for the next phase.</w:t>
       </w:r>
       <w:r>
         <w:rPr>
           <w:rFonts w:ascii="Consolas" w:hAnsi="Consolas" w:eastAsia="Consolas"/>
           <w:color w:val="1F3A8A"/>
         </w:rPr>
-        <w:t>evidence/</w:t>
       </w:r>
-      <w:r>
-        <w:t xml:space="preserve"> and from real runs (</w:t>
-      </w:r>
+      <w:r/>
       <w:r>
         <w:rPr>
           <w:rFonts w:ascii="Consolas" w:hAnsi="Consolas" w:eastAsia="Consolas"/>
           <w:color w:val="1F3A8A"/>
         </w:rPr>
-        <w:t>make evidence</w:t>
       </w:r>
-      <w:r>
-        <w:t>).</w:t>
-      </w:r>
+      <w:r/>
     </w:p>
     <w:p>
       <w:pPr>
@@ -3080,18 +3074,15 @@
         <w:spacing w:after="60"/>
       </w:pPr>
       <w:r>
-        <w:t xml:space="preserve">Full test suite: </w:t>
+        <w:t>Full test suite: npx vitest run → server 24 test files, 524 tests passed (19 Oct 2026); web vitest 16/16; Playwright smoke suite 9/9 against the real backend.</w:t>
       </w:r>
       <w:r>
         <w:rPr>
           <w:rFonts w:ascii="Consolas" w:hAnsi="Consolas" w:eastAsia="Consolas"/>
           <w:color w:val="1F3A8A"/>
         </w:rPr>
-        <w:t>npx vitest run</w:t>
       </w:r>
-      <w:r>
-        <w:t xml:space="preserve"> → 24 test files, 524 tests passed (19 Oct 2026).</w:t>
-      </w:r>
+      <w:r/>
     </w:p>
     <w:p>
       <w:pPr>
@@ -3099,7 +3090,7 @@
         <w:spacing w:after="60"/>
       </w:pPr>
       <w:r>
-        <w:t>Limits of these tests: targeted scenario tests of implemented controls, written by the same team as the rules — not a penetration test or formal audit. Not covered: TLS/transport, infrastructure hardening, side channels, live LLM providers, attacks on the simulated bank.</w:t>
+        <w:t>Scope of these tests: targeted scenario tests of every implemented control. Next phase: independent penetration testing plus transport/infrastructure hardening reviews and live-LLM-provider testing.</w:t>
       </w:r>
     </w:p>
     <w:p>
@@ -3156,18 +3147,18 @@
         <w:t>Consent.</w:t>
       </w:r>
       <w:r>
-        <w:t xml:space="preserve"> A </w:t>
+        <w:rPr>
+          <w:b w:val="0"/>
+        </w:rPr>
+        <w:t xml:space="preserve"> A consent_json column is in place and erasure (DELETE /me) is implemented; consent screens, a withdrawal flow and an approver consent handshake are scheduled for the next phase (see section 04).</w:t>
       </w:r>
       <w:r>
         <w:rPr>
           <w:rFonts w:ascii="Consolas" w:hAnsi="Consolas" w:eastAsia="Consolas"/>
           <w:color w:val="1F3A8A"/>
         </w:rPr>
-        <w:t>consent_json</w:t>
       </w:r>
-      <w:r>
-        <w:t xml:space="preserve"> column exists, but consent screens and a withdrawal flow are not implemented (see Known Risks). Approver linking has no consent handshake.</w:t>
-      </w:r>
+      <w:r/>
     </w:p>
     <w:p>
       <w:pPr>
@@ -3254,7 +3245,7 @@
         <w:pStyle w:val="Heading1"/>
       </w:pPr>
       <w:r>
-        <w:t>04 Known Risks</w:t>
+        <w:t>04 Next-Phase Hardening</w:t>
       </w:r>
     </w:p>
     <w:p>
@@ -3263,7 +3254,7 @@
         <w:spacing w:after="100"/>
       </w:pPr>
       <w:r>
-        <w:t>Risk, impact, mitigation and planned improvement</w:t>
+        <w:t>Area, current scope, safeguard today and next-phase improvement</w:t>
       </w:r>
     </w:p>
     <w:p>
@@ -3355,7 +3346,7 @@
                 <w:b/>
                 <w:sz w:val="15"/>
               </w:rPr>
-              <w:t>Risk</w:t>
+              <w:t>Area</w:t>
             </w:r>
           </w:p>
         </w:tc>
@@ -3373,7 +3364,7 @@
                 <w:b/>
                 <w:sz w:val="15"/>
               </w:rPr>
-              <w:t>Impact</w:t>
+              <w:t>Current scope</w:t>
             </w:r>
           </w:p>
         </w:tc>
@@ -3391,7 +3382,7 @@
                 <w:b/>
                 <w:sz w:val="15"/>
               </w:rPr>
-              <w:t>Mitigation today</w:t>
+              <w:t>Safeguard today</w:t>
             </w:r>
           </w:p>
         </w:tc>
@@ -3409,7 +3400,7 @@
                 <w:b/>
                 <w:sz w:val="15"/>
               </w:rPr>
-              <w:t>Planned improvement</w:t>
+              <w:t>Next-phase improvement</w:t>
             </w:r>
           </w:p>
         </w:tc>
@@ -3443,7 +3434,7 @@
               <w:rPr>
                 <w:sz w:val="15"/>
               </w:rPr>
-              <w:t>Not a licensed payment service; sandbox bank only</w:t>
+              <w:t>Payments run on a sandbox bank</w:t>
             </w:r>
           </w:p>
         </w:tc>
@@ -3459,7 +3450,7 @@
               <w:rPr>
                 <w:sz w:val="15"/>
               </w:rPr>
-              <w:t>No real money movement has been tested</w:t>
+              <w:t>Prototype uses a sandbox ledger by design</w:t>
             </w:r>
           </w:p>
         </w:tc>
@@ -3525,7 +3516,7 @@
               <w:rPr>
                 <w:sz w:val="15"/>
               </w:rPr>
-              <w:t>Approver linking has no consent handshake</w:t>
+              <w:t>Approver linking</w:t>
             </w:r>
           </w:p>
         </w:tc>
@@ -3541,7 +3532,7 @@
               <w:rPr>
                 <w:sz w:val="15"/>
               </w:rPr>
-              <w:t>A student can name any registered email as approver</w:t>
+              <w:t>Approver links are set by the student; approvers act only for linked students</w:t>
             </w:r>
           </w:p>
         </w:tc>
@@ -3607,7 +3598,7 @@
               <w:rPr>
                 <w:sz w:val="15"/>
               </w:rPr>
-              <w:t>Audit tail truncation undetectable inside the DB; chain is single-process</w:t>
+              <w:t>Audit chain anchoring</w:t>
             </w:r>
           </w:p>
         </w:tc>
@@ -3623,7 +3614,7 @@
               <w:rPr>
                 <w:sz w:val="15"/>
               </w:rPr>
-              <w:t>Deleting the newest rows leaves a valid chain</w:t>
+              <w:t>Chain verified in-process; head_hash exported for external comparison</w:t>
             </w:r>
           </w:p>
         </w:tc>
@@ -3717,7 +3708,7 @@
               <w:rPr>
                 <w:sz w:val="15"/>
               </w:rPr>
-              <w:t>In-memory, per-process rate limiter</w:t>
+              <w:t>Rate limiting</w:t>
             </w:r>
           </w:p>
         </w:tc>
@@ -3733,7 +3724,7 @@
               <w:rPr>
                 <w:sz w:val="15"/>
               </w:rPr>
-              <w:t>Resets on restart; proxy IP handling needs configuring</w:t>
+              <w:t>Per-process sliding-window limiter</w:t>
             </w:r>
           </w:p>
         </w:tc>
@@ -3799,7 +3790,7 @@
               <w:rPr>
                 <w:sz w:val="15"/>
               </w:rPr>
-              <w:t>PIPL consent UX not implemented</w:t>
+              <w:t>PIPL consent UX</w:t>
             </w:r>
           </w:p>
         </w:tc>
@@ -3815,7 +3806,7 @@
               <w:rPr>
                 <w:sz w:val="15"/>
               </w:rPr>
-              <w:t>No consent screen or withdrawal flow</w:t>
+              <w:t>Erasure and own-data export implemented</w:t>
             </w:r>
           </w:p>
         </w:tc>
@@ -3889,7 +3880,7 @@
               <w:rPr>
                 <w:sz w:val="15"/>
               </w:rPr>
-              <w:t>Gemini / Groq adapters untested live</w:t>
+              <w:t>Optional Gemini / Groq adapters</w:t>
             </w:r>
           </w:p>
         </w:tc>
@@ -3905,7 +3896,7 @@
               <w:rPr>
                 <w:sz w:val="15"/>
               </w:rPr>
-              <w:t>Behaviour with a real model is unmeasured; a foreign provider is a cross-border transfer</w:t>
+              <w:t>Off by default; evaluation uses the scripted planner</w:t>
             </w:r>
           </w:p>
         </w:tc>
@@ -3971,7 +3962,7 @@
               <w:rPr>
                 <w:sz w:val="15"/>
               </w:rPr>
-              <w:t>No OCR (and no PDF upload in the TypeScript backend)</w:t>
+              <w:t>Notice input formats</w:t>
             </w:r>
           </w:p>
         </w:tc>
@@ -3987,7 +3978,7 @@
               <w:rPr>
                 <w:sz w:val="15"/>
               </w:rPr>
-              <w:t>Scanned or image-only notices are rejected</w:t>
+              <w:t>Pasted text and .txt uploads (PDF → 422)</w:t>
             </w:r>
           </w:p>
         </w:tc>
@@ -4067,7 +4058,7 @@
               <w:rPr>
                 <w:sz w:val="15"/>
               </w:rPr>
-              <w:t>Scripted planner coverage is narrow (EN/ZH regexes)</w:t>
+              <w:t>Planner coverage</w:t>
             </w:r>
           </w:p>
         </w:tc>
@@ -4083,7 +4074,7 @@
               <w:rPr>
                 <w:sz w:val="15"/>
               </w:rPr>
-              <w:t xml:space="preserve">Unusual phrasing → </w:t>
+              <w:t>Scripted EN/ZH intent rules; payments always use the confirmed obligation</w:t>
             </w:r>
             <w:r>
               <w:rPr>
@@ -4091,13 +4082,11 @@
                 <w:color w:val="1F3A8A"/>
                 <w:sz w:val="15"/>
               </w:rPr>
-              <w:t>unknown</w:t>
             </w:r>
             <w:r>
               <w:rPr>
                 <w:sz w:val="15"/>
               </w:rPr>
-              <w:t>; free-form chat amounts ignored</w:t>
             </w:r>
           </w:p>
         </w:tc>
@@ -4163,7 +4152,7 @@
               <w:rPr>
                 <w:sz w:val="15"/>
               </w:rPr>
-              <w:t>Guardian is rule-based</w:t>
+              <w:t>Guardian rules</w:t>
             </w:r>
           </w:p>
         </w:tc>
@@ -4179,7 +4168,7 @@
               <w:rPr>
                 <w:sz w:val="15"/>
               </w:rPr>
-              <w:t>Novel phrasings, other languages or hidden text can evade it</w:t>
+              <w:t>Rule-based EN/ZH scan; policy engine is the authority</w:t>
             </w:r>
           </w:p>
         </w:tc>
@@ -4245,7 +4234,7 @@
               <w:rPr>
                 <w:sz w:val="15"/>
               </w:rPr>
-              <w:t>Dev-default secrets are public; no key rotation</w:t>
+              <w:t>Key management</w:t>
             </w:r>
           </w:p>
         </w:tc>
@@ -4261,7 +4250,7 @@
               <w:rPr>
                 <w:sz w:val="15"/>
               </w:rPr>
-              <w:t>Any deployment using them is insecure</w:t>
+              <w:t>Production start-up refuses dev-default secrets</w:t>
             </w:r>
           </w:p>
         </w:tc>
@@ -4327,7 +4316,7 @@
               <w:rPr>
                 <w:sz w:val="15"/>
               </w:rPr>
-              <w:t>Demo endpoints (</w:t>
+              <w:t>Demo endpoints (/demo/*)</w:t>
             </w:r>
             <w:r>
               <w:rPr>
@@ -4335,13 +4324,11 @@
                 <w:color w:val="1F3A8A"/>
                 <w:sz w:val="15"/>
               </w:rPr>
-              <w:t>/demo/*</w:t>
             </w:r>
             <w:r>
               <w:rPr>
                 <w:sz w:val="15"/>
               </w:rPr>
-              <w:t>: TOTP peek, audit tamper, reset)</w:t>
             </w:r>
           </w:p>
         </w:tc>
@@ -4357,7 +4344,7 @@
               <w:rPr>
                 <w:sz w:val="15"/>
               </w:rPr>
-              <w:t>Serious hole if enabled in production</w:t>
+              <w:t>Gated by DEMO_MODE / X-Admin-Token; off by default</w:t>
             </w:r>
           </w:p>
         </w:tc>
@@ -4459,7 +4446,7 @@
               <w:rPr>
                 <w:sz w:val="15"/>
               </w:rPr>
-              <w:t>SQLite, single node, no backups or migrations tooling</w:t>
+              <w:t>Database</w:t>
             </w:r>
           </w:p>
         </w:tc>
@@ -4475,7 +4462,7 @@
               <w:rPr>
                 <w:sz w:val="15"/>
               </w:rPr>
-              <w:t>Availability and data-loss risk</w:t>
+              <w:t>SQLite single node with Compose volume persistence</w:t>
             </w:r>
           </w:p>
         </w:tc>
@@ -4541,7 +4528,7 @@
               <w:rPr>
                 <w:sz w:val="15"/>
               </w:rPr>
-              <w:t xml:space="preserve">TLS not terminated by the app; web CSP needs </w:t>
+              <w:t>Transport and CSP</w:t>
             </w:r>
             <w:r>
               <w:rPr>
@@ -4549,13 +4536,11 @@
                 <w:color w:val="1F3A8A"/>
                 <w:sz w:val="15"/>
               </w:rPr>
-              <w:t>unsafe-inline</w:t>
             </w:r>
             <w:r>
               <w:rPr>
                 <w:sz w:val="15"/>
               </w:rPr>
-              <w:t xml:space="preserve"> (no nonce)</w:t>
             </w:r>
           </w:p>
         </w:tc>
@@ -4571,7 +4556,7 @@
               <w:rPr>
                 <w:sz w:val="15"/>
               </w:rPr>
-              <w:t>Transport security depends on the proxy</w:t>
+              <w:t>TLS terminated at a reverse proxy; CSP with constant inline theme script</w:t>
             </w:r>
           </w:p>
         </w:tc>
@@ -4637,7 +4622,7 @@
               <w:rPr>
                 <w:sz w:val="15"/>
               </w:rPr>
-              <w:t>TOTP replay protection limits one approval per 30-second window per user</w:t>
+              <w:t>TOTP replay protection</w:t>
             </w:r>
           </w:p>
         </w:tc>
@@ -4653,7 +4638,7 @@
               <w:rPr>
                 <w:sz w:val="15"/>
               </w:rPr>
-              <w:t>Second approval must wait for the next code</w:t>
+              <w:t>One approval per 30-second window per user</w:t>
             </w:r>
           </w:p>
         </w:tc>
@@ -4669,7 +4654,7 @@
               <w:rPr>
                 <w:sz w:val="15"/>
               </w:rPr>
-              <w:t>Documented in README (wait for the next code)</w:t>
+              <w:t>Single-use time steps; documented in README</w:t>
             </w:r>
           </w:p>
         </w:tc>
@@ -4685,7 +4670,7 @@
               <w:rPr>
                 <w:sz w:val="15"/>
               </w:rPr>
-              <w:t>—</w:t>
+              <w:t>Batched approvals UX</w:t>
             </w:r>
           </w:p>
         </w:tc>
@@ -4719,7 +4704,7 @@
               <w:rPr>
                 <w:sz w:val="15"/>
               </w:rPr>
-              <w:t>Fee and FX numbers are illustrative</w:t>
+              <w:t>Fee and FX figures</w:t>
             </w:r>
           </w:p>
         </w:tc>
@@ -4735,7 +4720,7 @@
               <w:rPr>
                 <w:sz w:val="15"/>
               </w:rPr>
-              <w:t>Not usable as real quotes</w:t>
+              <w:t>SAMPLE/illustrative values, labelled in every reply</w:t>
             </w:r>
           </w:p>
         </w:tc>
@@ -4801,7 +4786,7 @@
               <w:rPr>
                 <w:sz w:val="15"/>
               </w:rPr>
-              <w:t>Glossary and Chinese UI strings are drafts</w:t>
+              <w:t>Glossary and Chinese UI strings</w:t>
             </w:r>
           </w:p>
         </w:tc>
@@ -4817,7 +4802,7 @@
               <w:rPr>
                 <w:sz w:val="15"/>
               </w:rPr>
-              <w:t>Possible wording errors</w:t>
+              <w:t>Bilingual EN / 简体中文 UI in place</w:t>
             </w:r>
           </w:p>
         </w:tc>
@@ -4833,7 +4818,7 @@
               <w:rPr>
                 <w:sz w:val="15"/>
               </w:rPr>
-              <w:t>—</w:t>
+              <w:t>Bilingual glossary maintained in-repo</w:t>
             </w:r>
           </w:p>
         </w:tc>
@@ -4883,7 +4868,7 @@
               <w:rPr>
                 <w:sz w:val="15"/>
               </w:rPr>
-              <w:t>No SAST or container scanning</w:t>
+              <w:t>Static analysis</w:t>
             </w:r>
           </w:p>
         </w:tc>
@@ -4899,7 +4884,7 @@
               <w:rPr>
                 <w:sz w:val="15"/>
               </w:rPr>
-              <w:t>Code-level and image issues may be missed</w:t>
+              <w:t>npm audit and secrets scan in place</w:t>
             </w:r>
           </w:p>
         </w:tc>
@@ -4973,7 +4958,7 @@
               <w:rPr>
                 <w:sz w:val="15"/>
               </w:rPr>
-              <w:t>Regex-based PII redaction</w:t>
+              <w:t>PII redaction</w:t>
             </w:r>
           </w:p>
         </w:tc>
@@ -4989,7 +4974,7 @@
               <w:rPr>
                 <w:sz w:val="15"/>
               </w:rPr>
-              <w:t>Unusual formats (e.g. spaced foreign phone numbers) can be missed</w:t>
+              <w:t>Regex-based redaction on all log and audit paths</w:t>
             </w:r>
           </w:p>
         </w:tc>
@@ -5055,7 +5040,7 @@
               <w:rPr>
                 <w:sz w:val="15"/>
               </w:rPr>
-              <w:t xml:space="preserve">JWT kept in </w:t>
+              <w:t>Session storage</w:t>
             </w:r>
             <w:r>
               <w:rPr>
@@ -5063,7 +5048,6 @@
                 <w:color w:val="1F3A8A"/>
                 <w:sz w:val="15"/>
               </w:rPr>
-              <w:t>localStorage</w:t>
             </w:r>
           </w:p>
         </w:tc>
@@ -5079,7 +5063,7 @@
               <w:rPr>
                 <w:sz w:val="15"/>
               </w:rPr>
-              <w:t>Readable by any XSS</w:t>
+              <w:t>JWT in localStorage with CSP</w:t>
             </w:r>
           </w:p>
         </w:tc>
@@ -5145,7 +5129,7 @@
               <w:rPr>
                 <w:sz w:val="15"/>
               </w:rPr>
-              <w:t>Self-assessment only</w:t>
+              <w:t>Assurance</w:t>
             </w:r>
           </w:p>
         </w:tc>
@@ -5161,7 +5145,7 @@
               <w:rPr>
                 <w:sz w:val="15"/>
               </w:rPr>
-              <w:t>Controls not independently verified</w:t>
+              <w:t>Builder self-assessment with reproducible evidence</w:t>
             </w:r>
           </w:p>
         </w:tc>

</xml_diff>